<commit_message>
Address Biostatistics reviewer perspective: split supplementary materials, expand reproducibility/AI declarations, add MCSE to sensitivity tables, generate double-spaced PDF, update cover letter
Co-Authored-By: Tatsuki Onishi <bougtoir@gmail.com>
</commit_message>
<xml_diff>
--- a/results/manuscript/biostatistics_submission/biostatistics_tables_separate.docx
+++ b/results/manuscript/biostatistics_submission/biostatistics_tables_separate.docx
@@ -3065,7 +3065,7 @@
           </w:tcPr>
           <w:p>
             <w:r>
-              <w:t>—</w:t>
+              <w:t>0.00159</w:t>
             </w:r>
           </w:p>
         </w:tc>
@@ -3197,7 +3197,7 @@
           </w:tcPr>
           <w:p>
             <w:r>
-              <w:t>—</w:t>
+              <w:t>0.00936</w:t>
             </w:r>
           </w:p>
         </w:tc>
@@ -3329,7 +3329,7 @@
           </w:tcPr>
           <w:p>
             <w:r>
-              <w:t>—</w:t>
+              <w:t>0.01148</w:t>
             </w:r>
           </w:p>
         </w:tc>
@@ -3461,7 +3461,7 @@
           </w:tcPr>
           <w:p>
             <w:r>
-              <w:t>—</w:t>
+              <w:t>0.00729</w:t>
             </w:r>
           </w:p>
         </w:tc>
@@ -3593,7 +3593,7 @@
           </w:tcPr>
           <w:p>
             <w:r>
-              <w:t>—</w:t>
+              <w:t>0.00822</w:t>
             </w:r>
           </w:p>
         </w:tc>
@@ -3725,7 +3725,7 @@
           </w:tcPr>
           <w:p>
             <w:r>
-              <w:t>—</w:t>
+              <w:t>0.00057</w:t>
             </w:r>
           </w:p>
         </w:tc>
@@ -3857,7 +3857,7 @@
           </w:tcPr>
           <w:p>
             <w:r>
-              <w:t>—</w:t>
+              <w:t>0.00412</w:t>
             </w:r>
           </w:p>
         </w:tc>
@@ -3989,7 +3989,7 @@
           </w:tcPr>
           <w:p>
             <w:r>
-              <w:t>—</w:t>
+              <w:t>0.00547</w:t>
             </w:r>
           </w:p>
         </w:tc>
@@ -4121,7 +4121,7 @@
           </w:tcPr>
           <w:p>
             <w:r>
-              <w:t>—</w:t>
+              <w:t>0.00531</w:t>
             </w:r>
           </w:p>
         </w:tc>
@@ -4253,7 +4253,7 @@
           </w:tcPr>
           <w:p>
             <w:r>
-              <w:t>—</w:t>
+              <w:t>0.00573</w:t>
             </w:r>
           </w:p>
         </w:tc>
@@ -4385,7 +4385,7 @@
           </w:tcPr>
           <w:p>
             <w:r>
-              <w:t>—</w:t>
+              <w:t>0.00017</w:t>
             </w:r>
           </w:p>
         </w:tc>
@@ -4517,7 +4517,7 @@
           </w:tcPr>
           <w:p>
             <w:r>
-              <w:t>—</w:t>
+              <w:t>0.00170</w:t>
             </w:r>
           </w:p>
         </w:tc>
@@ -4649,7 +4649,7 @@
           </w:tcPr>
           <w:p>
             <w:r>
-              <w:t>—</w:t>
+              <w:t>0.00272</w:t>
             </w:r>
           </w:p>
         </w:tc>
@@ -4781,7 +4781,7 @@
           </w:tcPr>
           <w:p>
             <w:r>
-              <w:t>—</w:t>
+              <w:t>0.00209</w:t>
             </w:r>
           </w:p>
         </w:tc>
@@ -4913,7 +4913,7 @@
           </w:tcPr>
           <w:p>
             <w:r>
-              <w:t>—</w:t>
+              <w:t>0.00225</w:t>
             </w:r>
           </w:p>
         </w:tc>
@@ -5250,7 +5250,7 @@
           </w:tcPr>
           <w:p>
             <w:r>
-              <w:t>—</w:t>
+              <w:t>0.00030</w:t>
             </w:r>
           </w:p>
         </w:tc>
@@ -5382,7 +5382,7 @@
           </w:tcPr>
           <w:p>
             <w:r>
-              <w:t>—</w:t>
+              <w:t>0.00332</w:t>
             </w:r>
           </w:p>
         </w:tc>
@@ -5514,7 +5514,7 @@
           </w:tcPr>
           <w:p>
             <w:r>
-              <w:t>—</w:t>
+              <w:t>0.00462</w:t>
             </w:r>
           </w:p>
         </w:tc>
@@ -5646,7 +5646,7 @@
           </w:tcPr>
           <w:p>
             <w:r>
-              <w:t>—</w:t>
+              <w:t>0.00390</w:t>
             </w:r>
           </w:p>
         </w:tc>
@@ -5778,7 +5778,7 @@
           </w:tcPr>
           <w:p>
             <w:r>
-              <w:t>—</w:t>
+              <w:t>0.00400</w:t>
             </w:r>
           </w:p>
         </w:tc>
@@ -5910,7 +5910,7 @@
           </w:tcPr>
           <w:p>
             <w:r>
-              <w:t>—</w:t>
+              <w:t>0.00021</w:t>
             </w:r>
           </w:p>
         </w:tc>
@@ -6042,7 +6042,7 @@
           </w:tcPr>
           <w:p>
             <w:r>
-              <w:t>—</w:t>
+              <w:t>0.00285</w:t>
             </w:r>
           </w:p>
         </w:tc>
@@ -6174,7 +6174,7 @@
           </w:tcPr>
           <w:p>
             <w:r>
-              <w:t>—</w:t>
+              <w:t>0.00288</w:t>
             </w:r>
           </w:p>
         </w:tc>
@@ -6306,7 +6306,7 @@
           </w:tcPr>
           <w:p>
             <w:r>
-              <w:t>—</w:t>
+              <w:t>0.00324</w:t>
             </w:r>
           </w:p>
         </w:tc>
@@ -6438,7 +6438,7 @@
           </w:tcPr>
           <w:p>
             <w:r>
-              <w:t>—</w:t>
+              <w:t>0.00325</w:t>
             </w:r>
           </w:p>
         </w:tc>
@@ -6570,7 +6570,7 @@
           </w:tcPr>
           <w:p>
             <w:r>
-              <w:t>—</w:t>
+              <w:t>0.00057</w:t>
             </w:r>
           </w:p>
         </w:tc>
@@ -6702,7 +6702,7 @@
           </w:tcPr>
           <w:p>
             <w:r>
-              <w:t>—</w:t>
+              <w:t>0.00412</w:t>
             </w:r>
           </w:p>
         </w:tc>
@@ -6834,7 +6834,7 @@
           </w:tcPr>
           <w:p>
             <w:r>
-              <w:t>—</w:t>
+              <w:t>0.00547</w:t>
             </w:r>
           </w:p>
         </w:tc>
@@ -6966,7 +6966,7 @@
           </w:tcPr>
           <w:p>
             <w:r>
-              <w:t>—</w:t>
+              <w:t>0.00531</w:t>
             </w:r>
           </w:p>
         </w:tc>
@@ -7098,7 +7098,7 @@
           </w:tcPr>
           <w:p>
             <w:r>
-              <w:t>—</w:t>
+              <w:t>0.00573</w:t>
             </w:r>
           </w:p>
         </w:tc>
@@ -7435,7 +7435,7 @@
           </w:tcPr>
           <w:p>
             <w:r>
-              <w:t>—</w:t>
+              <w:t>0.00048</w:t>
             </w:r>
           </w:p>
         </w:tc>
@@ -7567,7 +7567,7 @@
           </w:tcPr>
           <w:p>
             <w:r>
-              <w:t>—</w:t>
+              <w:t>0.00455</w:t>
             </w:r>
           </w:p>
         </w:tc>
@@ -7699,7 +7699,7 @@
           </w:tcPr>
           <w:p>
             <w:r>
-              <w:t>—</w:t>
+              <w:t>0.00416</w:t>
             </w:r>
           </w:p>
         </w:tc>
@@ -7831,7 +7831,7 @@
           </w:tcPr>
           <w:p>
             <w:r>
-              <w:t>—</w:t>
+              <w:t>0.00436</w:t>
             </w:r>
           </w:p>
         </w:tc>
@@ -7963,7 +7963,7 @@
           </w:tcPr>
           <w:p>
             <w:r>
-              <w:t>—</w:t>
+              <w:t>0.00423</w:t>
             </w:r>
           </w:p>
         </w:tc>
@@ -8095,7 +8095,7 @@
           </w:tcPr>
           <w:p>
             <w:r>
-              <w:t>—</w:t>
+              <w:t>0.00057</w:t>
             </w:r>
           </w:p>
         </w:tc>
@@ -8227,7 +8227,7 @@
           </w:tcPr>
           <w:p>
             <w:r>
-              <w:t>—</w:t>
+              <w:t>0.00412</w:t>
             </w:r>
           </w:p>
         </w:tc>
@@ -8359,7 +8359,7 @@
           </w:tcPr>
           <w:p>
             <w:r>
-              <w:t>—</w:t>
+              <w:t>0.00547</w:t>
             </w:r>
           </w:p>
         </w:tc>
@@ -8491,7 +8491,7 @@
           </w:tcPr>
           <w:p>
             <w:r>
-              <w:t>—</w:t>
+              <w:t>0.00531</w:t>
             </w:r>
           </w:p>
         </w:tc>
@@ -8623,7 +8623,7 @@
           </w:tcPr>
           <w:p>
             <w:r>
-              <w:t>—</w:t>
+              <w:t>0.00573</w:t>
             </w:r>
           </w:p>
         </w:tc>
@@ -8755,7 +8755,7 @@
           </w:tcPr>
           <w:p>
             <w:r>
-              <w:t>—</w:t>
+              <w:t>0.00076</w:t>
             </w:r>
           </w:p>
         </w:tc>
@@ -8887,7 +8887,7 @@
           </w:tcPr>
           <w:p>
             <w:r>
-              <w:t>—</w:t>
+              <w:t>0.00268</w:t>
             </w:r>
           </w:p>
         </w:tc>
@@ -9019,7 +9019,7 @@
           </w:tcPr>
           <w:p>
             <w:r>
-              <w:t>—</w:t>
+              <w:t>0.00419</w:t>
             </w:r>
           </w:p>
         </w:tc>
@@ -9151,7 +9151,7 @@
           </w:tcPr>
           <w:p>
             <w:r>
-              <w:t>—</w:t>
+              <w:t>0.00248</w:t>
             </w:r>
           </w:p>
         </w:tc>
@@ -9283,7 +9283,7 @@
           </w:tcPr>
           <w:p>
             <w:r>
-              <w:t>—</w:t>
+              <w:t>0.00304</w:t>
             </w:r>
           </w:p>
         </w:tc>
@@ -9494,7 +9494,7 @@
           </w:tcPr>
           <w:p>
             <w:r>
-              <w:t>—</w:t>
+              <w:t>0.00057</w:t>
             </w:r>
           </w:p>
         </w:tc>
@@ -9534,7 +9534,7 @@
           </w:tcPr>
           <w:p>
             <w:r>
-              <w:t>—</w:t>
+              <w:t>0.00083</w:t>
             </w:r>
           </w:p>
         </w:tc>
@@ -9586,7 +9586,7 @@
           </w:tcPr>
           <w:p>
             <w:r>
-              <w:t>—</w:t>
+              <w:t>0.00412</w:t>
             </w:r>
           </w:p>
         </w:tc>
@@ -9626,7 +9626,7 @@
           </w:tcPr>
           <w:p>
             <w:r>
-              <w:t>—</w:t>
+              <w:t>0.00566</w:t>
             </w:r>
           </w:p>
         </w:tc>
@@ -9678,7 +9678,7 @@
           </w:tcPr>
           <w:p>
             <w:r>
-              <w:t>—</w:t>
+              <w:t>0.00547</w:t>
             </w:r>
           </w:p>
         </w:tc>
@@ -9718,7 +9718,7 @@
           </w:tcPr>
           <w:p>
             <w:r>
-              <w:t>—</w:t>
+              <w:t>0.00629</w:t>
             </w:r>
           </w:p>
         </w:tc>
@@ -9770,7 +9770,7 @@
           </w:tcPr>
           <w:p>
             <w:r>
-              <w:t>—</w:t>
+              <w:t>0.00531</w:t>
             </w:r>
           </w:p>
         </w:tc>
@@ -9810,7 +9810,7 @@
           </w:tcPr>
           <w:p>
             <w:r>
-              <w:t>—</w:t>
+              <w:t>0.00442</w:t>
             </w:r>
           </w:p>
         </w:tc>
@@ -9862,7 +9862,7 @@
           </w:tcPr>
           <w:p>
             <w:r>
-              <w:t>—</w:t>
+              <w:t>0.00573</w:t>
             </w:r>
           </w:p>
         </w:tc>
@@ -9902,7 +9902,7 @@
           </w:tcPr>
           <w:p>
             <w:r>
-              <w:t>—</w:t>
+              <w:t>0.00540</w:t>
             </w:r>
           </w:p>
         </w:tc>

</xml_diff>